<commit_message>
Updated with the latest changes
</commit_message>
<xml_diff>
--- a/docs/guides/Assess Reserved Instance Candidates (EA).docx
+++ b/docs/guides/Assess Reserved Instance Candidates (EA).docx
@@ -288,94 +288,6 @@
         </w:numPr>
       </w:pPr>
       <w:r>
-        <w:t xml:space="preserve">If </w:t>
-      </w:r>
-      <w:r>
-        <w:rPr>
-          <w:b/>
-          <w:bCs/>
-        </w:rPr>
-        <w:t>MCA</w:t>
-      </w:r>
-      <w:r>
-        <w:t>, a user account with…</w:t>
-      </w:r>
-    </w:p>
-    <w:p>
-      <w:pPr>
-        <w:pStyle w:val="ListParagraph"/>
-        <w:numPr>
-          <w:ilvl w:val="1"/>
-          <w:numId w:val="1"/>
-        </w:numPr>
-        <w:rPr>
-          <w:b/>
-          <w:bCs/>
-        </w:rPr>
-      </w:pPr>
-      <w:r>
-        <w:rPr>
-          <w:b/>
-          <w:bCs/>
-        </w:rPr>
-        <w:t>Billing Profile Reader</w:t>
-      </w:r>
-      <w:r>
-        <w:t xml:space="preserve"> or </w:t>
-      </w:r>
-      <w:r>
-        <w:rPr>
-          <w:b/>
-          <w:bCs/>
-        </w:rPr>
-        <w:t>Billing Account Reader</w:t>
-      </w:r>
-      <w:r>
-        <w:t xml:space="preserve"> if multiple profiles (</w:t>
-      </w:r>
-      <w:hyperlink r:id="rId9" w:anchor="download-usage-for-your-microsoft-customer-agreement" w:history="1">
-        <w:r>
-          <w:rPr>
-            <w:rStyle w:val="Hyperlink"/>
-          </w:rPr>
-          <w:t>View and download Azure usage and charges</w:t>
-        </w:r>
-      </w:hyperlink>
-      <w:r>
-        <w:t>)</w:t>
-      </w:r>
-    </w:p>
-    <w:p>
-      <w:pPr>
-        <w:pStyle w:val="ListParagraph"/>
-        <w:numPr>
-          <w:ilvl w:val="0"/>
-          <w:numId w:val="1"/>
-        </w:numPr>
-      </w:pPr>
-      <w:r>
-        <w:t xml:space="preserve">For </w:t>
-      </w:r>
-      <w:r>
-        <w:rPr>
-          <w:b/>
-          <w:bCs/>
-        </w:rPr>
-        <w:t>both</w:t>
-      </w:r>
-      <w:r>
-        <w:t>, a user account with…</w:t>
-      </w:r>
-    </w:p>
-    <w:p>
-      <w:pPr>
-        <w:pStyle w:val="ListParagraph"/>
-        <w:numPr>
-          <w:ilvl w:val="1"/>
-          <w:numId w:val="1"/>
-        </w:numPr>
-      </w:pPr>
-      <w:r>
         <w:rPr>
           <w:b/>
           <w:bCs/>
@@ -406,7 +318,7 @@
       <w:r>
         <w:t xml:space="preserve"> (in order to view the reservation costs in Azure Portal for the assessment, </w:t>
       </w:r>
-      <w:hyperlink r:id="rId10" w:anchor="who-can-buy-a-reservation" w:history="1">
+      <w:hyperlink r:id="rId9" w:anchor="who-can-buy-a-reservation" w:history="1">
         <w:r>
           <w:rPr>
             <w:rStyle w:val="Hyperlink"/>
@@ -420,8 +332,6 @@
     </w:p>
     <w:p>
       <w:pPr>
-        <w:spacing w:before="100" w:beforeAutospacing="1" w:after="100" w:afterAutospacing="1" w:line="240" w:lineRule="auto"/>
-        <w:outlineLvl w:val="1"/>
         <w:rPr>
           <w:rFonts w:ascii="Segoe UI" w:eastAsia="Times New Roman" w:hAnsi="Segoe UI" w:cs="Segoe UI"/>
           <w:sz w:val="36"/>
@@ -434,6 +344,25 @@
           <w:sz w:val="36"/>
           <w:szCs w:val="36"/>
         </w:rPr>
+        <w:br w:type="page"/>
+      </w:r>
+    </w:p>
+    <w:p>
+      <w:pPr>
+        <w:spacing w:before="100" w:beforeAutospacing="1" w:after="100" w:afterAutospacing="1" w:line="240" w:lineRule="auto"/>
+        <w:outlineLvl w:val="1"/>
+        <w:rPr>
+          <w:rFonts w:ascii="Segoe UI" w:eastAsia="Times New Roman" w:hAnsi="Segoe UI" w:cs="Segoe UI"/>
+          <w:sz w:val="36"/>
+          <w:szCs w:val="36"/>
+        </w:rPr>
+      </w:pPr>
+      <w:r>
+        <w:rPr>
+          <w:rFonts w:ascii="Segoe UI" w:eastAsia="Times New Roman" w:hAnsi="Segoe UI" w:cs="Segoe UI"/>
+          <w:sz w:val="36"/>
+          <w:szCs w:val="36"/>
+        </w:rPr>
         <w:lastRenderedPageBreak/>
         <w:t>Process steps</w:t>
       </w:r>
@@ -860,6 +789,61 @@
           <w:szCs w:val="21"/>
         </w:rPr>
         <w:t>Execute the data collection script</w:t>
+      </w:r>
+    </w:p>
+    <w:p>
+      <w:pPr>
+        <w:pStyle w:val="code-line"/>
+        <w:numPr>
+          <w:ilvl w:val="1"/>
+          <w:numId w:val="5"/>
+        </w:numPr>
+        <w:rPr>
+          <w:rFonts w:ascii="Segoe UI" w:hAnsi="Segoe UI" w:cs="Segoe UI"/>
+          <w:b/>
+          <w:bCs/>
+          <w:sz w:val="21"/>
+          <w:szCs w:val="21"/>
+        </w:rPr>
+      </w:pPr>
+      <w:r>
+        <w:rPr>
+          <w:rFonts w:ascii="Segoe UI" w:hAnsi="Segoe UI" w:cs="Segoe UI"/>
+          <w:b/>
+          <w:bCs/>
+          <w:sz w:val="21"/>
+          <w:szCs w:val="21"/>
+        </w:rPr>
+        <w:t xml:space="preserve">Note: </w:t>
+      </w:r>
+      <w:r>
+        <w:rPr>
+          <w:rFonts w:ascii="Segoe UI" w:hAnsi="Segoe UI" w:cs="Segoe UI"/>
+          <w:sz w:val="21"/>
+          <w:szCs w:val="21"/>
+          <w:highlight w:val="yellow"/>
+        </w:rPr>
+        <w:t>The</w:t>
+      </w:r>
+      <w:r>
+        <w:rPr>
+          <w:rFonts w:ascii="Segoe UI" w:hAnsi="Segoe UI" w:cs="Segoe UI"/>
+          <w:b/>
+          <w:bCs/>
+          <w:sz w:val="21"/>
+          <w:szCs w:val="21"/>
+          <w:highlight w:val="yellow"/>
+        </w:rPr>
+        <w:t xml:space="preserve"> data collection scripts </w:t>
+      </w:r>
+      <w:r>
+        <w:rPr>
+          <w:rFonts w:ascii="Segoe UI" w:hAnsi="Segoe UI" w:cs="Segoe UI"/>
+          <w:sz w:val="21"/>
+          <w:szCs w:val="21"/>
+          <w:highlight w:val="yellow"/>
+        </w:rPr>
+        <w:t>periodically need to be updated to remove duplicate data etc. so be sure to understand them and be ready to modify them when required</w:t>
       </w:r>
     </w:p>
     <w:p>
@@ -962,7 +946,7 @@
                     <pic:cNvPicPr/>
                   </pic:nvPicPr>
                   <pic:blipFill>
-                    <a:blip r:embed="rId11"/>
+                    <a:blip r:embed="rId10"/>
                     <a:stretch>
                       <a:fillRect/>
                     </a:stretch>
@@ -1176,7 +1160,7 @@
         </w:rPr>
         <w:t xml:space="preserve"> (</w:t>
       </w:r>
-      <w:hyperlink r:id="rId12" w:history="1">
+      <w:hyperlink r:id="rId11" w:history="1">
         <w:r>
           <w:rPr>
             <w:rStyle w:val="Hyperlink"/>
@@ -1679,6 +1663,7 @@
           <w:sz w:val="21"/>
           <w:szCs w:val="21"/>
         </w:rPr>
+        <w:lastRenderedPageBreak/>
         <w:t>Open "RI Assessment Report</w:t>
       </w:r>
       <w:r>
@@ -1811,7 +1796,6 @@
           <w:sz w:val="21"/>
           <w:szCs w:val="21"/>
         </w:rPr>
-        <w:lastRenderedPageBreak/>
         <w:t>Ensure that the "</w:t>
       </w:r>
       <w:proofErr w:type="spellStart"/>
@@ -2252,7 +2236,39 @@
           <w:sz w:val="21"/>
           <w:szCs w:val="21"/>
         </w:rPr>
-        <w:t>INFO: In the Power BI report there is a Slicer control with the title "Reserved Instance Group" at the top. This control filters the graph below based on selected Reserved Instance group</w:t>
+        <w:t xml:space="preserve">Open the "RI </w:t>
+      </w:r>
+      <w:r>
+        <w:rPr>
+          <w:rFonts w:ascii="Segoe UI" w:hAnsi="Segoe UI" w:cs="Segoe UI"/>
+          <w:sz w:val="21"/>
+          <w:szCs w:val="21"/>
+        </w:rPr>
+        <w:t>Assessment</w:t>
+      </w:r>
+      <w:r>
+        <w:rPr>
+          <w:rFonts w:ascii="Segoe UI" w:hAnsi="Segoe UI" w:cs="Segoe UI"/>
+          <w:sz w:val="21"/>
+          <w:szCs w:val="21"/>
+        </w:rPr>
+        <w:t xml:space="preserve"> </w:t>
+      </w:r>
+      <w:r>
+        <w:rPr>
+          <w:rFonts w:ascii="Segoe UI" w:hAnsi="Segoe UI" w:cs="Segoe UI"/>
+          <w:sz w:val="21"/>
+          <w:szCs w:val="21"/>
+        </w:rPr>
+        <w:t xml:space="preserve">List.pptx" template in </w:t>
+      </w:r>
+      <w:r>
+        <w:rPr>
+          <w:rFonts w:ascii="Segoe UI" w:hAnsi="Segoe UI" w:cs="Segoe UI"/>
+          <w:sz w:val="21"/>
+          <w:szCs w:val="21"/>
+        </w:rPr>
+        <w:t>PowerPoint</w:t>
       </w:r>
     </w:p>
     <w:p>
@@ -2274,6 +2290,28 @@
           <w:sz w:val="21"/>
           <w:szCs w:val="21"/>
         </w:rPr>
+        <w:t>INFO: In the Power BI report there is a Slicer control with the title "Reserved Instance Group" at the top. This control filters the graph below based on selected Reserved Instance group</w:t>
+      </w:r>
+    </w:p>
+    <w:p>
+      <w:pPr>
+        <w:pStyle w:val="code-line"/>
+        <w:numPr>
+          <w:ilvl w:val="1"/>
+          <w:numId w:val="5"/>
+        </w:numPr>
+        <w:rPr>
+          <w:rFonts w:ascii="Segoe UI" w:hAnsi="Segoe UI" w:cs="Segoe UI"/>
+          <w:sz w:val="21"/>
+          <w:szCs w:val="21"/>
+        </w:rPr>
+      </w:pPr>
+      <w:r>
+        <w:rPr>
+          <w:rFonts w:ascii="Segoe UI" w:hAnsi="Segoe UI" w:cs="Segoe UI"/>
+          <w:sz w:val="21"/>
+          <w:szCs w:val="21"/>
+        </w:rPr>
         <w:t xml:space="preserve">For each Reserved Instance </w:t>
       </w:r>
       <w:r>
@@ -2374,6 +2412,130 @@
           <w:sz w:val="21"/>
           <w:szCs w:val="21"/>
         </w:rPr>
+        <w:t>Prepare a new slide</w:t>
+      </w:r>
+      <w:r>
+        <w:rPr>
+          <w:rFonts w:ascii="Segoe UI" w:hAnsi="Segoe UI" w:cs="Segoe UI"/>
+          <w:sz w:val="21"/>
+          <w:szCs w:val="21"/>
+        </w:rPr>
+        <w:t xml:space="preserve"> in the “Appendix” section</w:t>
+      </w:r>
+      <w:r>
+        <w:rPr>
+          <w:rFonts w:ascii="Segoe UI" w:hAnsi="Segoe UI" w:cs="Segoe UI"/>
+          <w:sz w:val="21"/>
+          <w:szCs w:val="21"/>
+        </w:rPr>
+        <w:t xml:space="preserve"> for the Rese</w:t>
+      </w:r>
+      <w:r>
+        <w:rPr>
+          <w:rFonts w:ascii="Segoe UI" w:hAnsi="Segoe UI" w:cs="Segoe UI"/>
+          <w:sz w:val="21"/>
+          <w:szCs w:val="21"/>
+        </w:rPr>
+        <w:t>r</w:t>
+      </w:r>
+      <w:r>
+        <w:rPr>
+          <w:rFonts w:ascii="Segoe UI" w:hAnsi="Segoe UI" w:cs="Segoe UI"/>
+          <w:sz w:val="21"/>
+          <w:szCs w:val="21"/>
+        </w:rPr>
+        <w:t xml:space="preserve">ved Instance </w:t>
+      </w:r>
+      <w:r>
+        <w:rPr>
+          <w:rFonts w:ascii="Segoe UI" w:hAnsi="Segoe UI" w:cs="Segoe UI"/>
+          <w:sz w:val="21"/>
+          <w:szCs w:val="21"/>
+        </w:rPr>
+        <w:t>G</w:t>
+      </w:r>
+      <w:r>
+        <w:rPr>
+          <w:rFonts w:ascii="Segoe UI" w:hAnsi="Segoe UI" w:cs="Segoe UI"/>
+          <w:sz w:val="21"/>
+          <w:szCs w:val="21"/>
+        </w:rPr>
+        <w:t xml:space="preserve">roup in </w:t>
+      </w:r>
+      <w:r>
+        <w:rPr>
+          <w:rFonts w:ascii="Segoe UI" w:hAnsi="Segoe UI" w:cs="Segoe UI"/>
+          <w:sz w:val="21"/>
+          <w:szCs w:val="21"/>
+        </w:rPr>
+        <w:t xml:space="preserve">the </w:t>
+      </w:r>
+      <w:r>
+        <w:rPr>
+          <w:rFonts w:ascii="Segoe UI" w:hAnsi="Segoe UI" w:cs="Segoe UI"/>
+          <w:sz w:val="21"/>
+          <w:szCs w:val="21"/>
+        </w:rPr>
+        <w:t>PowerPoint</w:t>
+      </w:r>
+      <w:r>
+        <w:rPr>
+          <w:rFonts w:ascii="Segoe UI" w:hAnsi="Segoe UI" w:cs="Segoe UI"/>
+          <w:sz w:val="21"/>
+          <w:szCs w:val="21"/>
+        </w:rPr>
+        <w:t xml:space="preserve"> presentation</w:t>
+      </w:r>
+    </w:p>
+    <w:p>
+      <w:pPr>
+        <w:pStyle w:val="code-line"/>
+        <w:numPr>
+          <w:ilvl w:val="2"/>
+          <w:numId w:val="5"/>
+        </w:numPr>
+        <w:rPr>
+          <w:rFonts w:ascii="Segoe UI" w:hAnsi="Segoe UI" w:cs="Segoe UI"/>
+          <w:sz w:val="21"/>
+          <w:szCs w:val="21"/>
+        </w:rPr>
+      </w:pPr>
+      <w:r>
+        <w:rPr>
+          <w:rFonts w:ascii="Segoe UI" w:hAnsi="Segoe UI" w:cs="Segoe UI"/>
+          <w:sz w:val="21"/>
+          <w:szCs w:val="21"/>
+        </w:rPr>
+        <w:t xml:space="preserve">Make a screen clipping of the graph in Power BI and paste it into </w:t>
+      </w:r>
+      <w:r>
+        <w:rPr>
+          <w:rFonts w:ascii="Segoe UI" w:hAnsi="Segoe UI" w:cs="Segoe UI"/>
+          <w:sz w:val="21"/>
+          <w:szCs w:val="21"/>
+        </w:rPr>
+        <w:t>PowerPoint</w:t>
+      </w:r>
+    </w:p>
+    <w:p>
+      <w:pPr>
+        <w:pStyle w:val="code-line"/>
+        <w:numPr>
+          <w:ilvl w:val="2"/>
+          <w:numId w:val="5"/>
+        </w:numPr>
+        <w:rPr>
+          <w:rFonts w:ascii="Segoe UI" w:hAnsi="Segoe UI" w:cs="Segoe UI"/>
+          <w:sz w:val="21"/>
+          <w:szCs w:val="21"/>
+        </w:rPr>
+      </w:pPr>
+      <w:r>
+        <w:rPr>
+          <w:rFonts w:ascii="Segoe UI" w:hAnsi="Segoe UI" w:cs="Segoe UI"/>
+          <w:sz w:val="21"/>
+          <w:szCs w:val="21"/>
+        </w:rPr>
         <w:t xml:space="preserve">From the graph, determine whether it would be reasonable to </w:t>
       </w:r>
       <w:r>
@@ -2468,7 +2630,31 @@
           <w:sz w:val="21"/>
           <w:szCs w:val="21"/>
         </w:rPr>
-        <w:t xml:space="preserve"> for each region</w:t>
+        <w:t xml:space="preserve"> for each region and then copy the rows from Excel into </w:t>
+      </w:r>
+      <w:r>
+        <w:rPr>
+          <w:rFonts w:ascii="Segoe UI" w:hAnsi="Segoe UI" w:cs="Segoe UI"/>
+          <w:sz w:val="21"/>
+          <w:szCs w:val="21"/>
+        </w:rPr>
+        <w:t xml:space="preserve">the </w:t>
+      </w:r>
+      <w:r>
+        <w:rPr>
+          <w:rFonts w:ascii="Segoe UI" w:hAnsi="Segoe UI" w:cs="Segoe UI"/>
+          <w:sz w:val="21"/>
+          <w:szCs w:val="21"/>
+        </w:rPr>
+        <w:t>PowerPoint</w:t>
+      </w:r>
+      <w:r>
+        <w:rPr>
+          <w:rFonts w:ascii="Segoe UI" w:hAnsi="Segoe UI" w:cs="Segoe UI"/>
+          <w:sz w:val="21"/>
+          <w:szCs w:val="21"/>
+        </w:rPr>
+        <w:t xml:space="preserve"> slide</w:t>
       </w:r>
     </w:p>
     <w:p>
@@ -2620,7 +2806,23 @@
           <w:sz w:val="21"/>
           <w:szCs w:val="21"/>
         </w:rPr>
-        <w:t>Select an appropriate "Region"</w:t>
+        <w:t>Select an appropriate "Region" (=West Europe</w:t>
+      </w:r>
+      <w:r>
+        <w:rPr>
+          <w:rFonts w:ascii="Segoe UI" w:hAnsi="Segoe UI" w:cs="Segoe UI"/>
+          <w:sz w:val="21"/>
+          <w:szCs w:val="21"/>
+        </w:rPr>
+        <w:t>?</w:t>
+      </w:r>
+      <w:r>
+        <w:rPr>
+          <w:rFonts w:ascii="Segoe UI" w:hAnsi="Segoe UI" w:cs="Segoe UI"/>
+          <w:sz w:val="21"/>
+          <w:szCs w:val="21"/>
+        </w:rPr>
+        <w:t>)</w:t>
       </w:r>
     </w:p>
     <w:p>
@@ -2666,14 +2868,6 @@
         </w:rPr>
         <w:t>Select "Upfront" for "Billing frequency"</w:t>
       </w:r>
-      <w:r>
-        <w:rPr>
-          <w:rFonts w:ascii="Segoe UI" w:hAnsi="Segoe UI" w:cs="Segoe UI"/>
-          <w:sz w:val="21"/>
-          <w:szCs w:val="21"/>
-        </w:rPr>
-        <w:t xml:space="preserve"> (only used for price comparison)</w:t>
-      </w:r>
     </w:p>
     <w:p>
       <w:pPr>
@@ -2904,6 +3098,7 @@
           <w:sz w:val="21"/>
           <w:szCs w:val="21"/>
         </w:rPr>
+        <w:lastRenderedPageBreak/>
         <w:t>Note the "Upfront price per VM" cost in the lower right and type the value into the corresponding field in the "Price Matrix" tab</w:t>
       </w:r>
     </w:p>
@@ -3024,13 +3219,43 @@
         </w:rPr>
         <w:t>” for the lowest Price/Ratio that you find for that size group</w:t>
       </w:r>
-      <w:r>
-        <w:rPr>
-          <w:rFonts w:ascii="Segoe UI" w:hAnsi="Segoe UI" w:cs="Segoe UI"/>
-          <w:sz w:val="21"/>
-          <w:szCs w:val="21"/>
-        </w:rPr>
-        <w:br/>
+    </w:p>
+    <w:p>
+      <w:pPr>
+        <w:pStyle w:val="code-line"/>
+        <w:numPr>
+          <w:ilvl w:val="1"/>
+          <w:numId w:val="6"/>
+        </w:numPr>
+        <w:rPr>
+          <w:rFonts w:ascii="Segoe UI" w:hAnsi="Segoe UI" w:cs="Segoe UI"/>
+          <w:sz w:val="21"/>
+          <w:szCs w:val="21"/>
+        </w:rPr>
+      </w:pPr>
+      <w:r>
+        <w:rPr>
+          <w:rFonts w:ascii="Segoe UI" w:hAnsi="Segoe UI" w:cs="Segoe UI"/>
+          <w:sz w:val="21"/>
+          <w:szCs w:val="21"/>
+        </w:rPr>
+        <w:t xml:space="preserve">Prepare the </w:t>
+      </w:r>
+      <w:r>
+        <w:rPr>
+          <w:rFonts w:ascii="Segoe UI" w:hAnsi="Segoe UI" w:cs="Segoe UI"/>
+          <w:sz w:val="21"/>
+          <w:szCs w:val="21"/>
+        </w:rPr>
+        <w:t>initial</w:t>
+      </w:r>
+      <w:r>
+        <w:rPr>
+          <w:rFonts w:ascii="Segoe UI" w:hAnsi="Segoe UI" w:cs="Segoe UI"/>
+          <w:sz w:val="21"/>
+          <w:szCs w:val="21"/>
+        </w:rPr>
+        <w:t xml:space="preserve"> PowerPoint slides based on the Excel sheet</w:t>
       </w:r>
     </w:p>
     <w:p>
@@ -3056,7 +3281,6 @@
           <w:sz w:val="21"/>
           <w:szCs w:val="21"/>
         </w:rPr>
-        <w:lastRenderedPageBreak/>
         <w:t xml:space="preserve">Send </w:t>
       </w:r>
       <w:r>
@@ -3109,23 +3333,7 @@
           <w:sz w:val="21"/>
           <w:szCs w:val="21"/>
         </w:rPr>
-        <w:t xml:space="preserve">Save the </w:t>
-      </w:r>
-      <w:r>
-        <w:rPr>
-          <w:rFonts w:ascii="Segoe UI" w:hAnsi="Segoe UI" w:cs="Segoe UI"/>
-          <w:sz w:val="21"/>
-          <w:szCs w:val="21"/>
-        </w:rPr>
-        <w:t>E</w:t>
-      </w:r>
-      <w:r>
-        <w:rPr>
-          <w:rFonts w:ascii="Segoe UI" w:hAnsi="Segoe UI" w:cs="Segoe UI"/>
-          <w:sz w:val="21"/>
-          <w:szCs w:val="21"/>
-        </w:rPr>
-        <w:t>xcel file in the [</w:t>
+        <w:t>Save the PowerPoint and Excel files in the [</w:t>
       </w:r>
       <w:proofErr w:type="spellStart"/>
       <w:r>
@@ -3181,7 +3389,7 @@
           <w:sz w:val="21"/>
           <w:szCs w:val="21"/>
         </w:rPr>
-        <w:t xml:space="preserve">Send the Excel file to the </w:t>
+        <w:t xml:space="preserve">Send the PowerPoint and Excel files to the </w:t>
       </w:r>
       <w:r>
         <w:rPr>
@@ -3269,23 +3477,29 @@
           <w:szCs w:val="21"/>
         </w:rPr>
       </w:pPr>
-      <w:proofErr w:type="gramStart"/>
-      <w:r>
-        <w:rPr>
-          <w:rFonts w:ascii="Segoe UI" w:hAnsi="Segoe UI" w:cs="Segoe UI"/>
-          <w:sz w:val="21"/>
-          <w:szCs w:val="21"/>
-        </w:rPr>
-        <w:t>Review</w:t>
-      </w:r>
-      <w:proofErr w:type="gramEnd"/>
-      <w:r>
-        <w:rPr>
-          <w:rFonts w:ascii="Segoe UI" w:hAnsi="Segoe UI" w:cs="Segoe UI"/>
-          <w:sz w:val="21"/>
-          <w:szCs w:val="21"/>
-        </w:rPr>
-        <w:t xml:space="preserve"> the Excel file</w:t>
+      <w:r>
+        <w:rPr>
+          <w:rFonts w:ascii="Segoe UI" w:hAnsi="Segoe UI" w:cs="Segoe UI"/>
+          <w:sz w:val="21"/>
+          <w:szCs w:val="21"/>
+        </w:rPr>
+        <w:t xml:space="preserve">Review the </w:t>
+      </w:r>
+      <w:r>
+        <w:rPr>
+          <w:rFonts w:ascii="Segoe UI" w:hAnsi="Segoe UI" w:cs="Segoe UI"/>
+          <w:sz w:val="21"/>
+          <w:szCs w:val="21"/>
+        </w:rPr>
+        <w:t>PowerPoint</w:t>
+      </w:r>
+      <w:r>
+        <w:rPr>
+          <w:rFonts w:ascii="Segoe UI" w:hAnsi="Segoe UI" w:cs="Segoe UI"/>
+          <w:sz w:val="21"/>
+          <w:szCs w:val="21"/>
+        </w:rPr>
+        <w:t xml:space="preserve"> and Excel files</w:t>
       </w:r>
     </w:p>
     <w:p>

</xml_diff>